<commit_message>
docs: enrich user manual with comprehensive function-by-function instructions and updated docx
</commit_message>
<xml_diff>
--- a/deliverables/USER_MANUAL.docx
+++ b/deliverables/USER_MANUAL.docx
@@ -35,7 +35,7 @@
                 <w:color w:val="38BDF8"/>
                 <w:sz w:val="19"/>
               </w:rPr>
-              <w:t>OFFICIAL USER MANUAL &amp; GUIDE</w:t>
+              <w:t>OFFICIAL USER MANUAL &amp; FUNCTION GUIDE</w:t>
             </w:r>
           </w:p>
           <w:p>
@@ -51,7 +51,7 @@
               </w:rPr>
               <w:t>คู่มือการใช้งานระบบแฟ้มสะสมผลงานออนไลน์</w:t>
               <w:br/>
-              <w:t>(PFS - Portfolio &amp; Resume System)</w:t>
+              <w:t>และคำอธิบายฟังก์ชันการทำงานทีละขั้นตอน</w:t>
             </w:r>
           </w:p>
           <w:p>
@@ -64,9 +64,9 @@
                 <w:color w:val="CBD5E1"/>
                 <w:sz w:val="23"/>
               </w:rPr>
-              <w:t>คู่มือฉบับเข้าใจง่ายทีละขั้นตอน พร้อมภาพถ่ายหน้าจอระบบจริง (Real Screenshots)</w:t>
+              <w:t>PFS - Portfolio &amp; Resume System for Computer Engineering Students</w:t>
               <w:br/>
-              <w:t>สำหรับนักศึกษา, อาจารย์ที่ปรึกษา, ฝ่ายทะเบียน และผู้ใช้งานทั่วไป</w:t>
+              <w:t>ครอบคลุมทุกบทบาท: นักศึกษา, อาจารย์ที่ปรึกษา, กรรมการตรวจงาน และนายจ้าง</w:t>
             </w:r>
           </w:p>
         </w:tc>
@@ -320,7 +320,7 @@
           <w:rFonts w:ascii="TH Sarabun New" w:hAnsi="TH Sarabun New"/>
           <w:b/>
           <w:color w:val="1E3A8A"/>
-          <w:sz w:val="36"/>
+          <w:sz w:val="34"/>
         </w:rPr>
         <w:t>🌟 บทนำ: ระบบนี้คืออะไร และช่วยอะไรได้บ้าง?</w:t>
       </w:r>
@@ -334,7 +334,7 @@
           <w:rFonts w:ascii="TH Sarabun New" w:hAnsi="TH Sarabun New"/>
           <w:b/>
           <w:color w:val="0F172A"/>
-          <w:sz w:val="24"/>
+          <w:sz w:val="23"/>
         </w:rPr>
         <w:t xml:space="preserve">ระบบ PFS (Portfolio System) </w:t>
       </w:r>
@@ -342,9 +342,9 @@
         <w:rPr>
           <w:rFonts w:ascii="TH Sarabun New" w:hAnsi="TH Sarabun New"/>
           <w:color w:val="334155"/>
-          <w:sz w:val="24"/>
+          <w:sz w:val="23"/>
         </w:rPr>
-        <w:t>คือ เว็บไซต์ที่ช่วยให้นักศึกษาสามารถจัดทำ เรซูเม่ (Resume) และ แฟ้มสะสมผลงาน (Portfolio) รูปแบบดิจิทัลได้อย่างสวยงาม รวดเร็ว และเป็นมืออาชีพ ผ่านหน้าจอเว็บเบราว์เซอร์ โดยไม่ต้องมีความรู้ด้านการเขียนโค้ด ไม่ต้องติดตั้งโปรแกรมลงในคอมพิวเตอร์ และไม่ต้องเสียเวลาจัดหน้าใน Word หรือ Photoshop ให้ยุ่งยาก</w:t>
+        <w:t>คือ เว็บแอปพลิเคชันที่ช่วยให้นักศึกษาสามารถจัดทำ เรซูเม่ (Resume) และ แฟ้มสะสมผลงาน (Portfolio) ดิจิทัลได้อย่างสวยงาม รวดเร็ว และเป็นมืออาชีพ ผ่านหน้าต่างเว็บเบราว์เซอร์ โดยไม่ต้องมีความรู้ด้านการเขียนโค้ด ไม่ต้องติดตั้งโปรแกรมลงในคอมพิวเตอร์ และไม่ต้องจัดหน้า Word หรือ Photoshop ให้เสียเวลา</w:t>
       </w:r>
     </w:p>
     <w:p>
@@ -355,25 +355,25 @@
         <w:rPr>
           <w:rFonts w:ascii="TH Sarabun New" w:hAnsi="TH Sarabun New"/>
           <w:color w:val="334155"/>
-          <w:sz w:val="24"/>
+          <w:sz w:val="23"/>
         </w:rPr>
-        <w:t>เมื่อนักศึกษากรอกข้อมูลและตกแต่งเสร็จเรียบร้อย ระบบจะออก ลิงก์ผลงานส่วนบุคคล (Public URL เช่น https://portfolio.pfs.local/r/somchai-portfolio) ให้นักศึกษาสามารถคัดลอกนำไปส่งให้อาจารย์ที่ปรึกษาตรวจ หรือแนบในอีเมลสมัครงานกับบริษัทชั้นนำได้ทันที</w:t>
+        <w:t>เมื่อตกแต่งเสร็จ ระบบจะออก 'ลิงก์ผลงานส่วนบุคคล' (Public URL) ให้นำไปส่งอาจารย์ตรวจ หรือแนบในใบสมัครงานกับบริษัทได้ทันที พร้อมระบบ Responsive ที่ปรับขนาดให้อ่านง่ายบนมือถือและแท็บเล็ตอัตโนมัติ</w:t>
       </w:r>
     </w:p>
     <w:p>
       <w:pPr>
         <w:pStyle w:val="Heading2"/>
         <w:keepNext/>
-        <w:spacing w:before="280" w:after="80"/>
+        <w:spacing w:before="260" w:after="80"/>
       </w:pPr>
       <w:r>
         <w:rPr>
           <w:rFonts w:ascii="TH Sarabun New" w:hAnsi="TH Sarabun New"/>
           <w:b/>
           <w:color w:val="0369A1"/>
-          <w:sz w:val="30"/>
+          <w:sz w:val="28"/>
         </w:rPr>
-        <w:t>👥 ใครใช้งานระบบนี้บ้าง? (3 บทบาทหลัก)</w:t>
+        <w:t>👥 ภาพรวมผู้ใช้งาน 3 บทบาทหลัก</w:t>
       </w:r>
     </w:p>
     <w:tbl>
@@ -546,15 +546,15 @@
                 <w:color w:val="1E293B"/>
                 <w:sz w:val="22"/>
               </w:rPr>
-              <w:t>• เข้าสู่ระบบด้วยรหัสนักศึกษา</w:t>
+              <w:t>• ล็อกอินด้วยรหัสนักศึกษา</w:t>
               <w:br/>
-              <w:t>• เลือกเทมเพลตเรซูเม่สวยงามในคลิกเดียว</w:t>
+              <w:t>• เลือกเทมเพลตเรซูเม่ 6 สไตล์ในคลิกเดียว</w:t>
               <w:br/>
-              <w:t>• กรอกประวัติ ทักษะ และผลงานโครงงาน</w:t>
+              <w:t>• ใส่บล็อกข้อมูล ทักษะ และผลงานโครงงาน</w:t>
               <w:br/>
-              <w:t>• ปรับแต่งสี ขนาดการ์ด และรูปแบบฟอนต์</w:t>
+              <w:t>• ปรับแต่งฟอนต์ สีสัน และขนาดการ์ด</w:t>
               <w:br/>
-              <w:t>• บันทึกแบบร่าง และกดเผยแพร่เพื่อรับลิงก์แชร์</w:t>
+              <w:t>• บันทึกแบบร่าง และกดเผยแพร่เพื่อแชร์ลิงก์</w:t>
             </w:r>
           </w:p>
         </w:tc>
@@ -638,7 +638,7 @@
               <w:br/>
               <w:t>• เพิ่มรายชื่อนักศึกษาใหม่เข้าระบบ</w:t>
               <w:br/>
-              <w:t>• กดรีเซ็ตรหัสผ่านให้นักศึกษาที่ลืมรหัส</w:t>
+              <w:t>• รีเซ็ตรหัสผ่านให้นักศึกษาที่ลืมรหัส</w:t>
             </w:r>
           </w:p>
         </w:tc>
@@ -716,9 +716,9 @@
               </w:rPr>
               <w:t>• เปิดชมหน้าเว็บผลงานของนักศึกษาผ่านลิงก์</w:t>
               <w:br/>
-              <w:t>• เปิดดูได้ทันทีโดยไม่ต้องลงทะเบียนหรือล็อกอิน</w:t>
+              <w:t>• เปิดดูได้ทันทีโดยไม่ต้องลงทะเบียน</w:t>
               <w:br/>
-              <w:t>• รองรับทั้งคอมพิวเตอร์ แท็บเล็ต และสมาร์ตโฟน</w:t>
+              <w:t>• พิมพ์หรือบันทึกเป็น PDF มาตรฐาน A4</w:t>
             </w:r>
           </w:p>
         </w:tc>
@@ -740,9 +740,9 @@
           <w:rFonts w:ascii="TH Sarabun New" w:hAnsi="TH Sarabun New"/>
           <w:b/>
           <w:color w:val="1E3A8A"/>
-          <w:sz w:val="36"/>
+          <w:sz w:val="34"/>
         </w:rPr>
-        <w:t>🚀 บทที่ 1: การเข้าสู่ระบบครั้งแรก (Login)</w:t>
+        <w:t>🚀 บทที่ 1: การเข้าสู่ระบบและการระบุตัวตน (Authentication)</w:t>
       </w:r>
     </w:p>
     <w:p>
@@ -753,9 +753,9 @@
         <w:rPr>
           <w:rFonts w:ascii="TH Sarabun New" w:hAnsi="TH Sarabun New"/>
           <w:color w:val="334155"/>
-          <w:sz w:val="24"/>
+          <w:sz w:val="23"/>
         </w:rPr>
-        <w:t>ทุกครั้งที่ต้องการเริ่มใช้งานระบบ ให้เปิดโปรแกรมท่องเว็บ (Google Chrome, Microsoft Edge, หรือ Safari) แล้วเข้าไปที่หน้าเว็บของระบบ จากนั้นจะพบกับหน้าต่างเข้าสู่ระบบดังภาพด้านล่าง:</w:t>
+        <w:t>ทุกครั้งที่ต้องการเริ่มใช้งานระบบ ให้เปิดโปรแกรมท่องเว็บ (Google Chrome, Microsoft Edge, หรือ Safari) แล้วเข้าไปที่หน้าเว็บของระบบ /login จากนั้นจะพบกับหน้าต่างเข้าสู่ระบบดังภาพจริงด้านล่าง:</w:t>
       </w:r>
     </w:p>
     <w:p>
@@ -817,16 +817,16 @@
       <w:pPr>
         <w:pStyle w:val="Heading2"/>
         <w:keepNext/>
-        <w:spacing w:before="280" w:after="80"/>
+        <w:spacing w:before="260" w:after="80"/>
       </w:pPr>
       <w:r>
         <w:rPr>
           <w:rFonts w:ascii="TH Sarabun New" w:hAnsi="TH Sarabun New"/>
           <w:b/>
           <w:color w:val="0369A1"/>
-          <w:sz w:val="30"/>
+          <w:sz w:val="28"/>
         </w:rPr>
-        <w:t>📌 คำอธิบายจุดสำคัญในการเข้าสู่ระบบ:</w:t>
+        <w:t>📌 ฟังก์ชัน 1.1: วิธีการเข้าสู่ระบบทีละขั้นตอน (Step-by-Step Login)</w:t>
       </w:r>
     </w:p>
     <w:p>
@@ -839,17 +839,17 @@
           <w:rFonts w:ascii="TH Sarabun New" w:hAnsi="TH Sarabun New"/>
           <w:b/>
           <w:color w:val="0F172A"/>
-          <w:sz w:val="24"/>
+          <w:sz w:val="23"/>
         </w:rPr>
-        <w:t xml:space="preserve">[1] ช่องระบุตัวตน (Username / Email): </w:t>
+        <w:t xml:space="preserve">ขั้นตอนที่ 1 — ช่องระบุตัวตน (Identifier): </w:t>
       </w:r>
       <w:r>
         <w:rPr>
           <w:rFonts w:ascii="TH Sarabun New" w:hAnsi="TH Sarabun New"/>
           <w:color w:val="334155"/>
-          <w:sz w:val="24"/>
+          <w:sz w:val="23"/>
         </w:rPr>
-        <w:t>สำหรับ นักศึกษา ให้พิมพ์ รหัสนักศึกษา 8 หลัก (เช่น 65010001) หรืออีเมลที่ลงทะเบียนไว้ / สำหรับ อาจารย์และผู้ดูแล ให้พิมพ์อีเมลประจำตำแหน่ง (เช่น admin@pfs.local)</w:t>
+        <w:t>สำหรับ นักศึกษา ให้พิมพ์ รหัสนักศึกษา 8-13 หลัก (เช่น 65010001) หรืออีเมลที่ลงทะเบียนไว้ / สำหรับ อาจารย์และผู้ดูแล ให้พิมพ์อีเมลประจำตำแหน่ง เช่น admin@pfs.local</w:t>
       </w:r>
     </w:p>
     <w:p>
@@ -862,17 +862,17 @@
           <w:rFonts w:ascii="TH Sarabun New" w:hAnsi="TH Sarabun New"/>
           <w:b/>
           <w:color w:val="0F172A"/>
-          <w:sz w:val="24"/>
+          <w:sz w:val="23"/>
         </w:rPr>
-        <w:t xml:space="preserve">[2] ช่องรหัสผ่าน (Password): </w:t>
+        <w:t xml:space="preserve">ขั้นตอนที่ 2 — ช่องรหัสผ่าน (Password): </w:t>
       </w:r>
       <w:r>
         <w:rPr>
           <w:rFonts w:ascii="TH Sarabun New" w:hAnsi="TH Sarabun New"/>
           <w:color w:val="334155"/>
-          <w:sz w:val="24"/>
+          <w:sz w:val="23"/>
         </w:rPr>
-        <w:t>พิมพ์รหัสผ่านส่วนตัวของท่าน (สำหรับการเข้าใช้งานครั้งแรก ระบบอาจตั้งรหัสผ่านเริ่มต้นเป็นรหัสนักศึกษา)</w:t>
+        <w:t>กรอกรหัสผ่านส่วนตัวของท่านในช่องนี้</w:t>
       </w:r>
     </w:p>
     <w:p>
@@ -885,40 +885,46 @@
           <w:rFonts w:ascii="TH Sarabun New" w:hAnsi="TH Sarabun New"/>
           <w:b/>
           <w:color w:val="0F172A"/>
-          <w:sz w:val="24"/>
+          <w:sz w:val="23"/>
         </w:rPr>
-        <w:t xml:space="preserve">[3] ปุ่มเข้าสู่ระบบ (Sign In): </w:t>
+        <w:t xml:space="preserve">ขั้นตอนที่ 3 — ปุ่มเข้าสู่ระบบ (Sign In): </w:t>
       </w:r>
       <w:r>
         <w:rPr>
           <w:rFonts w:ascii="TH Sarabun New" w:hAnsi="TH Sarabun New"/>
           <w:color w:val="334155"/>
-          <w:sz w:val="24"/>
+          <w:sz w:val="23"/>
         </w:rPr>
-        <w:t>เมื่อกรอกข้อมูลครบถ้วนแล้ว ให้คลิกปุ่มสีน้ำเงินนี้เพื่อเข้าสู่ระบบ</w:t>
+        <w:t>คลิกปุ่มสีน้ำเงินนี้เพื่อยืนยันตัวตน</w:t>
       </w:r>
     </w:p>
     <w:p>
       <w:pPr>
-        <w:pStyle w:val="ListBullet"/>
-        <w:spacing w:before="0" w:after="60" w:line="276" w:lineRule="auto"/>
+        <w:pStyle w:val="Heading2"/>
+        <w:keepNext/>
+        <w:spacing w:before="260" w:after="80"/>
       </w:pPr>
       <w:r>
         <w:rPr>
           <w:rFonts w:ascii="TH Sarabun New" w:hAnsi="TH Sarabun New"/>
           <w:b/>
-          <w:color w:val="0F172A"/>
-          <w:sz w:val="24"/>
+          <w:color w:val="0369A1"/>
+          <w:sz w:val="28"/>
         </w:rPr>
-        <w:t xml:space="preserve">[4] การนำทางอัตโนมัติ (Role-based Redirection): </w:t>
+        <w:t>📌 ฟังก์ชัน 1.2: การนำทางและแยกสิทธิ์อัตโนมัติ (Role-based Routing)</w:t>
       </w:r>
+    </w:p>
+    <w:p>
+      <w:pPr>
+        <w:spacing w:before="0" w:after="80" w:line="276" w:lineRule="auto"/>
+      </w:pPr>
       <w:r>
         <w:rPr>
           <w:rFonts w:ascii="TH Sarabun New" w:hAnsi="TH Sarabun New"/>
           <w:color w:val="334155"/>
-          <w:sz w:val="24"/>
+          <w:sz w:val="23"/>
         </w:rPr>
-        <w:t>ระบบได้รับการออกแบบให้แยกหน้าจอให้อัตโนมัติ หากล็อกอินด้วยบัญชีนักศึกษาจะพาไปหน้าแดชบอร์ดนักศึกษาทันที ส่วนอาจารย์จะพาไปที่ศูนย์ควบคุมผู้ดูแล</w:t>
+        <w:t>เมื่อเข้าสู่ระบบสำเร็จ ระบบจะแยกหน้าจอให้อัตโนมัติ โดยนักศึกษาจะถูกพาไปยังหน้าแดชบอร์ดนักศึกษา (/student) ส่วนอาจารย์จะถูกพาไปยังศูนย์ควบคุมผู้ดูแล (/admin) ทันทีโดยไม่ต้องเลือกเมนูเอง</w:t>
       </w:r>
     </w:p>
     <w:tbl>
@@ -995,7 +1001,7 @@
           <w:rFonts w:ascii="TH Sarabun New" w:hAnsi="TH Sarabun New"/>
           <w:b/>
           <w:color w:val="1E3A8A"/>
-          <w:sz w:val="36"/>
+          <w:sz w:val="34"/>
         </w:rPr>
         <w:t>🎓 บทที่ 2: คู่มือสำหรับ "นักศึกษา" (Student Guide)</w:t>
       </w:r>
@@ -1004,14 +1010,14 @@
       <w:pPr>
         <w:pStyle w:val="Heading2"/>
         <w:keepNext/>
-        <w:spacing w:before="280" w:after="80"/>
+        <w:spacing w:before="260" w:after="80"/>
       </w:pPr>
       <w:r>
         <w:rPr>
           <w:rFonts w:ascii="TH Sarabun New" w:hAnsi="TH Sarabun New"/>
           <w:b/>
           <w:color w:val="0369A1"/>
-          <w:sz w:val="30"/>
+          <w:sz w:val="28"/>
         </w:rPr>
         <w:t>2.1 หน้าแดชบอร์ดของฉัน (Student Dashboard)</w:t>
       </w:r>
@@ -1024,7 +1030,7 @@
         <w:rPr>
           <w:rFonts w:ascii="TH Sarabun New" w:hAnsi="TH Sarabun New"/>
           <w:color w:val="334155"/>
-          <w:sz w:val="24"/>
+          <w:sz w:val="23"/>
         </w:rPr>
         <w:t>เมื่อเข้าสู่ระบบด้วยบัญชีนักศึกษา จะพบกับหน้าศูนย์รวมข้อมูลส่วนตัว ซึ่งจะรายงานสถานะผลงาน ลิงก์สำหรับแชร์ และปุ่มคำสั่งสำคัญทั้งหมด:</w:t>
       </w:r>
@@ -1081,23 +1087,23 @@
           <w:color w:val="64748B"/>
           <w:sz w:val="20"/>
         </w:rPr>
-        <w:t>📷 ภาพที่ 2: หน้าแดชบอร์ดส่วนตัวของนักศึกษา (Student Dashboard) (ภาพถ่ายหน้าจอระบบจริง)</w:t>
+        <w:t>📷 ภาพที่ 2: หน้าแดชบอร์ดส่วนตัวของนักศึกษาจริง (Student Dashboard) (ภาพถ่ายหน้าจอระบบจริง)</w:t>
       </w:r>
     </w:p>
     <w:p>
       <w:pPr>
         <w:pStyle w:val="Heading3"/>
         <w:keepNext/>
-        <w:spacing w:before="200" w:after="60"/>
+        <w:spacing w:before="180" w:after="60"/>
       </w:pPr>
       <w:r>
         <w:rPr>
           <w:rFonts w:ascii="TH Sarabun New" w:hAnsi="TH Sarabun New"/>
           <w:b/>
           <w:color w:val="334155"/>
-          <w:sz w:val="26"/>
+          <w:sz w:val="25"/>
         </w:rPr>
-        <w:t>📌 4 จุดสำคัญบนหน้าแดชบอร์ดที่ต้องทราบ:</w:t>
+        <w:t>📌 อธิบายการใช้งานฟังก์ชันบนหน้าแดชบอร์ด:</w:t>
       </w:r>
     </w:p>
     <w:p>
@@ -1110,17 +1116,17 @@
           <w:rFonts w:ascii="TH Sarabun New" w:hAnsi="TH Sarabun New"/>
           <w:b/>
           <w:color w:val="0F172A"/>
-          <w:sz w:val="24"/>
+          <w:sz w:val="23"/>
         </w:rPr>
-        <w:t xml:space="preserve">1. ปุ่ม "เข้าสู่สตูดิโอออกแบบ (Edit Canvas)": </w:t>
+        <w:t xml:space="preserve">• ฟังก์ชัน 2.1.1 — ตรวจสอบสถานะและความสมบูรณ์: </w:t>
       </w:r>
       <w:r>
         <w:rPr>
           <w:rFonts w:ascii="TH Sarabun New" w:hAnsi="TH Sarabun New"/>
           <w:color w:val="334155"/>
-          <w:sz w:val="24"/>
+          <w:sz w:val="23"/>
         </w:rPr>
-        <w:t>คลิกปุ่มสีน้ำเงินนี้เพื่อเปิดสตูดิโอสำหรับพิมพ์ข้อมูล ใส่รูปภาพ และจัดหน้าเรซูเม่</w:t>
+        <w:t>การ์ดสรุปจะรายงานว่าเรซูโม่อยู่ในสถานะ 'เผยแพร่แล้ว (Published)' สีเขียว หรือ 'แบบร่าง (Draft)' สีส้ม พร้อมแถบเปอร์เซ็นต์ความสมบูรณ์เนื้อหา (% Completion) ที่ช่วยบอกว่าเราใส่ข้อมูลครบทุกหมวดหรือยัง</w:t>
       </w:r>
     </w:p>
     <w:p>
@@ -1133,17 +1139,17 @@
           <w:rFonts w:ascii="TH Sarabun New" w:hAnsi="TH Sarabun New"/>
           <w:b/>
           <w:color w:val="0F172A"/>
-          <w:sz w:val="24"/>
+          <w:sz w:val="23"/>
         </w:rPr>
-        <w:t xml:space="preserve">2. การ์ดสรุปสถานะผลงาน: </w:t>
+        <w:t xml:space="preserve">• ฟังก์ชัน 2.1.2 — การคัดลอกลิงก์ผลงานไปส่ง (Quick Copy Link): </w:t>
       </w:r>
       <w:r>
         <w:rPr>
           <w:rFonts w:ascii="TH Sarabun New" w:hAnsi="TH Sarabun New"/>
           <w:color w:val="334155"/>
-          <w:sz w:val="24"/>
+          <w:sz w:val="23"/>
         </w:rPr>
-        <w:t>แสดงว่าผลงานของท่านอยู่ในสถานะ 'เผยแพร่แล้ว (Published)' หรือ 'แบบร่าง (Draft)' พร้อมแถบแสดงเปอร์เซ็นต์ความสมบูรณ์ของเนื้อหา ช่วยเตือนว่าใส่ข้อมูลครบทุกหมวดหรือยัง</w:t>
+        <w:t>กล่องสีน้ำเงินจะแสดง URL ผลงานของท่าน เพียงคลิกปุ่มสีเขียว 'คัดลอกลิงก์ (Copy)' ระบบจะก๊อบปี้ลิงก์ลงคลิปบอร์ดทันที สามารถนำไปวางส่งอาจารย์ทางแชต หรือแนบในอีเมลสมัครงานได้ทันที และกดปุ่ม 'เปิดดูหน้าจริง (View Live)' เพื่อตรวจสอบหน้าตาที่คนภายนอกเห็น</w:t>
       </w:r>
     </w:p>
     <w:p>
@@ -1156,17 +1162,17 @@
           <w:rFonts w:ascii="TH Sarabun New" w:hAnsi="TH Sarabun New"/>
           <w:b/>
           <w:color w:val="0F172A"/>
-          <w:sz w:val="24"/>
+          <w:sz w:val="23"/>
         </w:rPr>
-        <w:t xml:space="preserve">3. กล่องลิงก์แชร์ผลงานสาธารณะ (Public URL): </w:t>
+        <w:t xml:space="preserve">• ฟังก์ชัน 2.1.3 — การแก้ไขข้อมูลส่วนตัว (Profile Management): </w:t>
       </w:r>
       <w:r>
         <w:rPr>
           <w:rFonts w:ascii="TH Sarabun New" w:hAnsi="TH Sarabun New"/>
           <w:color w:val="334155"/>
-          <w:sz w:val="24"/>
+          <w:sz w:val="23"/>
         </w:rPr>
-        <w:t>แสดง URL ประจำตัวของท่าน พร้อมปุ่ม 'คัดลอกลิงก์' สีเขียว เพียงคลิกเดียวก็สามารถนำลิงก์ไปส่งให้อาจารย์ทางแชต หรือแนบในอีเมลสมัครงานได้ทันที</w:t>
+        <w:t>คลิกปุ่ม 'แก้ไขโปรไฟล์' เพื่อแก้ไขชื่อภาษาไทย/อังกฤษ แผนกวิชา หรือระดับชั้นปี แล้วกดปุ่มบันทึก</w:t>
       </w:r>
     </w:p>
     <w:p>
@@ -1179,17 +1185,17 @@
           <w:rFonts w:ascii="TH Sarabun New" w:hAnsi="TH Sarabun New"/>
           <w:b/>
           <w:color w:val="0F172A"/>
-          <w:sz w:val="24"/>
+          <w:sz w:val="23"/>
         </w:rPr>
-        <w:t xml:space="preserve">4. เมนูจัดการบัญชีผู้ใช้งาน: </w:t>
+        <w:t xml:space="preserve">• ฟังก์ชัน 2.1.4 — การเปลี่ยนรหัสผ่าน (Change Password): </w:t>
       </w:r>
       <w:r>
         <w:rPr>
           <w:rFonts w:ascii="TH Sarabun New" w:hAnsi="TH Sarabun New"/>
           <w:color w:val="334155"/>
-          <w:sz w:val="24"/>
+          <w:sz w:val="23"/>
         </w:rPr>
-        <w:t>มีเมนูสำหรับตรวจสอบและแก้ไขชื่อ-นามสกุล อีเมล และเมนูสำหรับเปลี่ยนรหัสผ่านใหม่</w:t>
+        <w:t>คลิกปุ่ม 'เปลี่ยนรหัสผ่าน' กรอกรหัสเดิม และรหัสใหม่ที่ต้องการ 2 ครั้ง แล้วกดยืนยันเพื่อเปลี่ยนรหัสผ่านทันที</w:t>
       </w:r>
     </w:p>
     <w:p>
@@ -1201,16 +1207,16 @@
       <w:pPr>
         <w:pStyle w:val="Heading2"/>
         <w:keepNext/>
-        <w:spacing w:before="280" w:after="80"/>
+        <w:spacing w:before="260" w:after="80"/>
       </w:pPr>
       <w:r>
         <w:rPr>
           <w:rFonts w:ascii="TH Sarabun New" w:hAnsi="TH Sarabun New"/>
           <w:b/>
           <w:color w:val="0369A1"/>
-          <w:sz w:val="30"/>
+          <w:sz w:val="28"/>
         </w:rPr>
-        <w:t>2.2 สตูดิโอออกแบบผลงาน (Studio Grid Canvas Editor)</w:t>
+        <w:t>2.2 สตูดิโอออกแบบผลงานแบบกริด (Studio Grid Canvas Editor)</w:t>
       </w:r>
     </w:p>
     <w:p>
@@ -1221,9 +1227,9 @@
         <w:rPr>
           <w:rFonts w:ascii="TH Sarabun New" w:hAnsi="TH Sarabun New"/>
           <w:color w:val="334155"/>
-          <w:sz w:val="24"/>
+          <w:sz w:val="23"/>
         </w:rPr>
-        <w:t>เมื่อคลิกปุ่ม 'เข้าสู่สตูดิโอออกแบบ' ท่านจะพบกับหน้าจอออกแบบและจัดหน้าเรซูเม่ ซึ่งออกแบบมาให้ใช้งานง่ายเหมือนการจัดวางบล็อกเลโก้ โดยแบ่งพื้นที่ออกเป็น 3 โซนหลัก:</w:t>
+        <w:t>เมื่อคลิกปุ่ม 'เข้าสู่สตูดิโอออกแบบ (Edit Canvas)' จากหน้าแดชบอร์ด จะเข้าสู่หน้าจอออกแบบผลงาน ซึ่งออกแบบมาให้จัดวางบล็อกเนื้อหาได้อย่างอิสระ:</w:t>
       </w:r>
     </w:p>
     <w:p>
@@ -1278,23 +1284,23 @@
           <w:color w:val="64748B"/>
           <w:sz w:val="20"/>
         </w:rPr>
-        <w:t>📷 ภาพที่ 3: สตูดิโอออกแบบ Portfolio แบบกริด (Studio Grid Canvas Editor) (ภาพถ่ายหน้าจอระบบจริง)</w:t>
+        <w:t>📷 ภาพที่ 3: สตูดิโอออกแบบ Portfolio แบบกริดจริง (Studio Grid Canvas Editor) (ภาพถ่ายหน้าจอระบบจริง)</w:t>
       </w:r>
     </w:p>
     <w:p>
       <w:pPr>
         <w:pStyle w:val="Heading3"/>
         <w:keepNext/>
-        <w:spacing w:before="200" w:after="60"/>
+        <w:spacing w:before="180" w:after="60"/>
       </w:pPr>
       <w:r>
         <w:rPr>
           <w:rFonts w:ascii="TH Sarabun New" w:hAnsi="TH Sarabun New"/>
           <w:b/>
           <w:color w:val="334155"/>
-          <w:sz w:val="26"/>
+          <w:sz w:val="25"/>
         </w:rPr>
-        <w:t>📌 โครงสร้าง 3 โซนทำงานในสตูดิโอ:</w:t>
+        <w:t>📌 อธิบายการใช้งานแต่ละฟังก์ชันในสตูดิโอ:</w:t>
       </w:r>
     </w:p>
     <w:p>
@@ -1307,17 +1313,17 @@
           <w:rFonts w:ascii="TH Sarabun New" w:hAnsi="TH Sarabun New"/>
           <w:b/>
           <w:color w:val="0F172A"/>
-          <w:sz w:val="24"/>
+          <w:sz w:val="23"/>
         </w:rPr>
-        <w:t xml:space="preserve">[1] คลังบล็อกเนื้อหา (Blocks Library - ฝั่งซ้าย): </w:t>
+        <w:t xml:space="preserve">• ฟังก์ชัน 2.2.1 — การเลือกเทมเพลตสำเร็จรูป (Template Gallery): </w:t>
       </w:r>
       <w:r>
         <w:rPr>
           <w:rFonts w:ascii="TH Sarabun New" w:hAnsi="TH Sarabun New"/>
           <w:color w:val="334155"/>
-          <w:sz w:val="24"/>
+          <w:sz w:val="23"/>
         </w:rPr>
-        <w:t>รวบรวมหมวดหมู่ข้อมูลที่จำเป็นสำหรับเรซูเม่ไว้ครบครัน เช่น ข้อมูลส่วนตัว (Profile), แนะนำตัว (About Me), ทักษะคอมพิวเตอร์ (Skills), โครงงานเด่น (Projects), ประสบการณ์ (Experience), รางวัล (Certificates) เพียงคลิกที่บล็อกที่ต้องการ การ์ดนั้นจะถูกวางลงบนหน้าเว็บทันที</w:t>
+        <w:t>คลิกปุ่ม 'เลือกเทมเพลต' บนแถบคำสั่งด้านบน สามารถเปลี่ยนดีไซน์ได้ 6 สไตล์ในคลิกเดียว เช่น Professional (เน้นทางการ น่าเชื่อถือ), Modern Minimal (เรียบหรู คมชัด), Creative (สีสันสดใส มีพลัง) หรือ Tech Engineer (ฟอนต์สไตล์นักพัฒนา)</w:t>
       </w:r>
     </w:p>
     <w:p>
@@ -1330,17 +1336,17 @@
           <w:rFonts w:ascii="TH Sarabun New" w:hAnsi="TH Sarabun New"/>
           <w:b/>
           <w:color w:val="0F172A"/>
-          <w:sz w:val="24"/>
+          <w:sz w:val="23"/>
         </w:rPr>
-        <w:t xml:space="preserve">[2] ผืนผ้าใบจัดวาง (Canvas - โซนตรงกลาง): </w:t>
+        <w:t xml:space="preserve">• ฟังก์ชัน 2.2.2 — การเพิ่มบล็อกหมวดหมู่เนื้อหา (Blocks Library): </w:t>
       </w:r>
       <w:r>
         <w:rPr>
           <w:rFonts w:ascii="TH Sarabun New" w:hAnsi="TH Sarabun New"/>
           <w:color w:val="334155"/>
-          <w:sz w:val="24"/>
+          <w:sz w:val="23"/>
         </w:rPr>
-        <w:t>แสดงผลงานจริงตามตำแหน่งที่จะแสดงให้คนภายนอกเห็น ท่านสามารถคลิกเลือกการ์ดใดการ์ดหนึ่งเพื่อแก้ไขเนื้อหาหรือจัดตำแหน่งได้อย่างอิสระ</w:t>
+        <w:t>แผงด้านซ้ายรวบรวมบล็อกข้อมูลที่จำเป็นไว้ครบถ้วน เช่น Profile (ข้อมูลติดต่อ), About Me (แนะนำตัว), Education (การศึกษา), Skills (ทักษะโปรแกรม), Projects (โครงงานเด่น), Experience (ประสบการณ์ฝึกงาน), Certificates (เกียรติบัตร) เพียงคลิกที่บล็อกที่ต้องการ การ์ดนั้นจะเพิ่มลงบน Canvas ตรงกลางทันที</w:t>
       </w:r>
     </w:p>
     <w:p>
@@ -1353,17 +1359,17 @@
           <w:rFonts w:ascii="TH Sarabun New" w:hAnsi="TH Sarabun New"/>
           <w:b/>
           <w:color w:val="0F172A"/>
-          <w:sz w:val="24"/>
+          <w:sz w:val="23"/>
         </w:rPr>
-        <w:t xml:space="preserve">[3] แผงปรับแต่งรายละเอียด (Property Inspector - ฝั่งขวา): </w:t>
+        <w:t xml:space="preserve">• ฟังก์ชัน 2.2.3 — การจัดผังตารางและปรับขนาดการ์ด (Grid Layout &amp; Sizing): </w:t>
       </w:r>
       <w:r>
         <w:rPr>
           <w:rFonts w:ascii="TH Sarabun New" w:hAnsi="TH Sarabun New"/>
           <w:color w:val="334155"/>
-          <w:sz w:val="24"/>
+          <w:sz w:val="23"/>
         </w:rPr>
-        <w:t>เมื่อคลิกที่การ์ดใดๆ หน้าต่างด้านขวาจะเปิดขึ้นมาเพื่อให้ท่าน: พิมพ์ข้อความ, เลือกเปลี่ยนฟอนต์ตัวอักษร, ปรับขนาดความกว้างของการ์ด (เต็มหน้าจอ หรือ ครึ่งหน้าจอวางคู่กัน), หรือกดปุ่มถังขยะสีแดงเพื่อลบการ์ดที่ไม่ต้องการออก</w:t>
+        <w:t>คลิกที่การ์ดแล้วเลือกขนาดในแผงขวา: เลือก 'เต็มหน้าจอ (12 ช่อง)' สำหรับหัวข้อหลัก หรือ 'ครึ่งหน้าจอ (6 ช่อง)' เพื่อวางการ์ดประกบคู่กัน พร้อมปุ่มลูกศรขึ้น-ลงเพื่อสลับตำแหน่ง และปุ่มดวงตาเพื่อซ่อนหัวข้อชั่วคราว</w:t>
       </w:r>
     </w:p>
     <w:p>
@@ -1376,17 +1382,63 @@
           <w:rFonts w:ascii="TH Sarabun New" w:hAnsi="TH Sarabun New"/>
           <w:b/>
           <w:color w:val="0F172A"/>
-          <w:sz w:val="24"/>
+          <w:sz w:val="23"/>
         </w:rPr>
-        <w:t xml:space="preserve">[4] แถบคำสั่งด้านบน (Command Bar): </w:t>
+        <w:t xml:space="preserve">• ฟังก์ชัน 2.2.4 — การพิมพ์และแก้ไขเนื้อหา (Content Inspector): </w:t>
       </w:r>
       <w:r>
         <w:rPr>
           <w:rFonts w:ascii="TH Sarabun New" w:hAnsi="TH Sarabun New"/>
           <w:color w:val="334155"/>
-          <w:sz w:val="24"/>
+          <w:sz w:val="23"/>
         </w:rPr>
-        <w:t>ด้านบนสุดมีเมนู 'เลือกเทมเพลตสำเร็จรูป' ให้เปลี่ยนสไตล์เรซูเม่ได้ในคลิกเดียว พร้อมปุ่ม 'บันทึกฉบับร่าง' (สีส้ม) และปุ่ม 'เผยแพร่' (สีเขียว)</w:t>
+        <w:t>เมื่อคลิกเลือกการ์ดใดๆ บนผืนผ้าใบ แผงด้านขวาในแท็บ 'เนื้อหา (Content)' จะเปิดขึ้นมาให้พิมพ์ชื่อหัวข้อ, บรรยายรายละเอียด, เพิ่มรายการทักษะ หรือลิสต์ผลงานโครงงานพร้อมแนบลิงก์ GitHub ได้ไม่จำกัด</w:t>
+      </w:r>
+    </w:p>
+    <w:p>
+      <w:pPr>
+        <w:pStyle w:val="ListBullet"/>
+        <w:spacing w:before="0" w:after="60" w:line="276" w:lineRule="auto"/>
+      </w:pPr>
+      <w:r>
+        <w:rPr>
+          <w:rFonts w:ascii="TH Sarabun New" w:hAnsi="TH Sarabun New"/>
+          <w:b/>
+          <w:color w:val="0F172A"/>
+          <w:sz w:val="23"/>
+        </w:rPr>
+        <w:t xml:space="preserve">• ฟังก์ชัน 2.2.5 — การปรับแต่งสีสันและฟอนต์ (Design &amp; Styling): </w:t>
+      </w:r>
+      <w:r>
+        <w:rPr>
+          <w:rFonts w:ascii="TH Sarabun New" w:hAnsi="TH Sarabun New"/>
+          <w:color w:val="334155"/>
+          <w:sz w:val="23"/>
+        </w:rPr>
+        <w:t>ในแท็บ 'ดีไซน์ (Design)' แผงขวามือ สามารถเลือกเปลี่ยนสีธีมการ์ดจากจานสี และเลือกลายตัวอักษรยอดนิยม เช่น Prompt, Kanit, Inter, Fira Code รวมถึงจัดตำแหน่งข้อความชิดซ้าย/กึ่งกลาง/ชิดขวา</w:t>
+      </w:r>
+    </w:p>
+    <w:p>
+      <w:pPr>
+        <w:pStyle w:val="ListBullet"/>
+        <w:spacing w:before="0" w:after="60" w:line="276" w:lineRule="auto"/>
+      </w:pPr>
+      <w:r>
+        <w:rPr>
+          <w:rFonts w:ascii="TH Sarabun New" w:hAnsi="TH Sarabun New"/>
+          <w:b/>
+          <w:color w:val="0F172A"/>
+          <w:sz w:val="23"/>
+        </w:rPr>
+        <w:t xml:space="preserve">• ฟังก์ชัน 2.2.6 — การลบบล็อกที่ไม่ต้องการ (Delete Block): </w:t>
+      </w:r>
+      <w:r>
+        <w:rPr>
+          <w:rFonts w:ascii="TH Sarabun New" w:hAnsi="TH Sarabun New"/>
+          <w:color w:val="334155"/>
+          <w:sz w:val="23"/>
+        </w:rPr>
+        <w:t>หากไม่ต้องการแสดงหมวดหมู่นั้น ให้คลิกปุ่มถังขยะสีแดงที่แผงขวาเพื่อลบการ์ดออกจากหน้าเว็บ</w:t>
       </w:r>
     </w:p>
     <w:p>
@@ -1398,14 +1450,14 @@
       <w:pPr>
         <w:pStyle w:val="Heading2"/>
         <w:keepNext/>
-        <w:spacing w:before="280" w:after="80"/>
+        <w:spacing w:before="260" w:after="80"/>
       </w:pPr>
       <w:r>
         <w:rPr>
           <w:rFonts w:ascii="TH Sarabun New" w:hAnsi="TH Sarabun New"/>
           <w:b/>
           <w:color w:val="0369A1"/>
-          <w:sz w:val="30"/>
+          <w:sz w:val="28"/>
         </w:rPr>
         <w:t>2.3 ความแตกต่างระหว่าง "บันทึกแบบร่าง" กับ "เผยแพร่"</w:t>
       </w:r>
@@ -1901,7 +1953,7 @@
                 <w:color w:val="1E293B"/>
                 <w:sz w:val="21"/>
               </w:rPr>
-              <w:t>หลังจากแต่งหน้าตาเรซูเม่เสร็จแล้ว หากนักศึกษาคลิกเฉพาะปุ่ม 'บันทึกฉบับร่าง' แต่ลืมคลิกปุ่ม 'เผยแพร่ (Publish)' สีเขียว อาจารย์หรือบริษัทที่ได้รับลิงก์จะไม่สามารถเปิดดูผลงานได้ ดังนั้นเมื่อทำงานเสร็จทุกครั้ง ต้องมั่นใจว่าได้กดปุ่มเผยแพร่แล้วนะครับ</w:t>
+              <w:t>หลังจากแต่งหน้าตาเรซูเม่เสร็จแล้ว หากนักศึกษาคลิกเฉพาะปุ่ม 'บันทึกฉบับร่าง' แต่ลืมคลิกปุ่ม 'เผยแพร่ (Publish)' สีเขียว อาจารย์หรือบริษัทที่ได้รับลิงก์จะไม่สามารถเปิดดูผลงานได้ ดังนั้นเมื่อแต่งเสร็จทุกครั้ง ต้องมั่นใจว่าได้กดปุ่มเผยแพร่แล้วนะครับ</w:t>
             </w:r>
           </w:p>
         </w:tc>
@@ -1928,7 +1980,7 @@
           <w:rFonts w:ascii="TH Sarabun New" w:hAnsi="TH Sarabun New"/>
           <w:b/>
           <w:color w:val="1E3A8A"/>
-          <w:sz w:val="36"/>
+          <w:sz w:val="34"/>
         </w:rPr>
         <w:t>🛡️ บทที่ 3: คู่มือสำหรับ "อาจารย์และผู้ดูแลระบบ" (Admin Guide)</w:t>
       </w:r>
@@ -1941,9 +1993,9 @@
         <w:rPr>
           <w:rFonts w:ascii="TH Sarabun New" w:hAnsi="TH Sarabun New"/>
           <w:color w:val="334155"/>
-          <w:sz w:val="24"/>
+          <w:sz w:val="23"/>
         </w:rPr>
-        <w:t>สำหรับอาจารย์ที่ปรึกษา หัวหน้าสาขาวิชา หรือเจ้าหน้าที่ดูแลระบบ หน้าต่างศูนย์ควบคุมผู้ดูแลระบบ (Admin Dashboard) คือศูนย์กลางในการติดตามความคืบหน้า ตรวจผลงาน และบริหารจัดการผู้ใช้งานทั้งหลักสูตร:</w:t>
+        <w:t>สำหรับอาจารย์ที่ปรึกษา หัวหน้าสาขาวิชา หรือเจ้าหน้าที่ดูแลระบบ หน้าต่างศูนย์ควบคุมผู้ดูแลระบบ (/admin) คือศูนย์กลางในการติดตามความคืบหน้า ตรวจผลงาน และบริหารจัดการผู้ใช้งานทั้งหลักสูตร:</w:t>
       </w:r>
     </w:p>
     <w:p>
@@ -1998,23 +2050,23 @@
           <w:color w:val="64748B"/>
           <w:sz w:val="20"/>
         </w:rPr>
-        <w:t>📷 ภาพที่ 4: หน้าศูนย์ควบคุมผู้ดูแลระบบและตรวจงาน (Admin Dashboard) (ภาพถ่ายหน้าจอระบบจริง)</w:t>
+        <w:t>📷 ภาพที่ 4: หน้าศูนย์ควบคุมผู้ดูแลระบบและตรวจงานจริง (Admin Dashboard) (ภาพถ่ายหน้าจอระบบจริง)</w:t>
       </w:r>
     </w:p>
     <w:p>
       <w:pPr>
         <w:pStyle w:val="Heading2"/>
         <w:keepNext/>
-        <w:spacing w:before="280" w:after="80"/>
+        <w:spacing w:before="260" w:after="80"/>
       </w:pPr>
       <w:r>
         <w:rPr>
           <w:rFonts w:ascii="TH Sarabun New" w:hAnsi="TH Sarabun New"/>
           <w:b/>
           <w:color w:val="0369A1"/>
-          <w:sz w:val="30"/>
+          <w:sz w:val="28"/>
         </w:rPr>
-        <w:t>📌 4 ฟังก์ชันหลักในการบริหารและตรวจงาน:</w:t>
+        <w:t>📌 ฟังก์ชันการทำงานของผู้ดูแลระบบทีละขั้นตอน:</w:t>
       </w:r>
     </w:p>
     <w:p>
@@ -2027,17 +2079,17 @@
           <w:rFonts w:ascii="TH Sarabun New" w:hAnsi="TH Sarabun New"/>
           <w:b/>
           <w:color w:val="0F172A"/>
-          <w:sz w:val="24"/>
+          <w:sz w:val="23"/>
         </w:rPr>
-        <w:t xml:space="preserve">1. แถบสรุปสถิติภาพรวม (Overview Metrics): </w:t>
+        <w:t xml:space="preserve">• ฟังก์ชัน 3.1 — การตรวจดูสถิติภาพรวมทั้งรุ่น (Overview Metrics): </w:t>
       </w:r>
       <w:r>
         <w:rPr>
           <w:rFonts w:ascii="TH Sarabun New" w:hAnsi="TH Sarabun New"/>
           <w:color w:val="334155"/>
-          <w:sz w:val="24"/>
+          <w:sz w:val="23"/>
         </w:rPr>
-        <w:t>แสดงจำนวนนักศึกษาทั้งหมดในระบบ, จำนวนคนที่เผยแพร่ผลงานแล้ว (Published), จำนวนคนที่อยู่ระหว่างทำ (Draft), และคนที่ยังไม่เริ่มทำ ช่วยให้อาจารย์ทราบภาพรวมความคืบหน้าของรุ่นได้ในทันที</w:t>
+        <w:t>ดูตัวเลขสรุปผลได้ทันที: มีนักศึกษาทั้งหมดกี่คน, ส่งงานแล้วกี่คน (Published), อยู่ระหว่างทำกี่คน (Draft), และยังไม่เริ่มทำกี่คน ช่วยให้อาจารย์วางแผนติดตามงานได้ทันท่วงที</w:t>
       </w:r>
     </w:p>
     <w:p>
@@ -2050,17 +2102,17 @@
           <w:rFonts w:ascii="TH Sarabun New" w:hAnsi="TH Sarabun New"/>
           <w:b/>
           <w:color w:val="0F172A"/>
-          <w:sz w:val="24"/>
+          <w:sz w:val="23"/>
         </w:rPr>
-        <w:t xml:space="preserve">2. ช่องค้นหาและตัวกรองสถานะ (Search &amp; Filter): </w:t>
+        <w:t xml:space="preserve">• ฟังก์ชัน 3.2 — ระบบค้นหาและตัวกรอง (Search &amp; Filter): </w:t>
       </w:r>
       <w:r>
         <w:rPr>
           <w:rFonts w:ascii="TH Sarabun New" w:hAnsi="TH Sarabun New"/>
           <w:color w:val="334155"/>
-          <w:sz w:val="24"/>
+          <w:sz w:val="23"/>
         </w:rPr>
-        <w:t>อาจารย์สามารถพิมพ์รหัสนักศึกษา หรือชื่อ-นามสกุล เพื่อค้นหานักศึกษาที่ต้องการได้อย่างรวดเร็ว พร้อมตัวกรองเลือกดูเฉพาะคนที่ยังส่งงานไม่เรียบร้อย</w:t>
+        <w:t>พิมพ์ชื่อ, รหัสนักศึกษา หรืออีเมลในช่องค้นหา ตารางจะกรองรายชื่อให้ทันทีแบบเรียลไทม์ พร้อมแท็บคัดกรองเลือกดูเฉพาะคนที่ยังไม่ส่งงาน</w:t>
       </w:r>
     </w:p>
     <w:p>
@@ -2073,17 +2125,17 @@
           <w:rFonts w:ascii="TH Sarabun New" w:hAnsi="TH Sarabun New"/>
           <w:b/>
           <w:color w:val="0F172A"/>
-          <w:sz w:val="24"/>
+          <w:sz w:val="23"/>
         </w:rPr>
-        <w:t xml:space="preserve">3. ปุ่มเพิ่มนักศึกษาใหม่ (+ Add Student): </w:t>
+        <w:t xml:space="preserve">• ฟังก์ชัน 3.3 — การเปิดตรวจผลงานที่เผยแพร่แล้ว (View Live Portfolio): </w:t>
       </w:r>
       <w:r>
         <w:rPr>
           <w:rFonts w:ascii="TH Sarabun New" w:hAnsi="TH Sarabun New"/>
           <w:color w:val="334155"/>
-          <w:sz w:val="24"/>
+          <w:sz w:val="23"/>
         </w:rPr>
-        <w:t>ใช้เมื่อมีนักศึกษาลงทะเบียนเพิ่มในเทอม เพียงคลิกปุ่มสีม่วงนี้ แล้วกรอกรหัสนักศึกษา ชื่อ และอีเมล ระบบจะเปิดบัญชีเริ่มต้นให้ทันที</w:t>
+        <w:t>คลิกปุ่ม 'เปิดดู &gt;' (สีน้ำเงิน) ในแถวของนักศึกษาที่เผยแพร่ผลงานแล้ว เพื่อเปิดดูเรซูเม่หน้าจริงแบบที่คนภายนอกเห็นและประเมินให้คะแนน</w:t>
       </w:r>
     </w:p>
     <w:p>
@@ -2096,25 +2148,86 @@
           <w:rFonts w:ascii="TH Sarabun New" w:hAnsi="TH Sarabun New"/>
           <w:b/>
           <w:color w:val="0F172A"/>
-          <w:sz w:val="24"/>
+          <w:sz w:val="23"/>
         </w:rPr>
-        <w:t xml:space="preserve">4. ปุ่มปฏิบัติการในตาราง (Action Buttons): </w:t>
+        <w:t xml:space="preserve">• ฟังก์ชัน 3.4 — ฟังก์ชันพิเศษ: การเปิดตรวจแบบร่าง (Draft Review 🔍): </w:t>
       </w:r>
       <w:r>
         <w:rPr>
           <w:rFonts w:ascii="TH Sarabun New" w:hAnsi="TH Sarabun New"/>
           <w:color w:val="334155"/>
-          <w:sz w:val="24"/>
+          <w:sz w:val="23"/>
         </w:rPr>
-        <w:t>ในแต่ละแถวของนักศึกษา จะมีปุ่มสั่งการ 4 รูปแบบ:</w:t>
-        <w:br/>
-        <w:t xml:space="preserve">   • ปุ่ม 'เปิดดู &gt;' (สีน้ำเงิน): คลิกเพื่อเปิดดูเรซูเม่หน้าจริงแบบที่คนภายนอกเห็น</w:t>
-        <w:br/>
-        <w:t xml:space="preserve">   • ปุ่ม 'ตรวจแบบร่าง 🔍' (สีส้ม): ฟังก์ชันพิเศษสำหรับอาจารย์ สามารถคลิกเข้าไปตรวจดูความคืบหน้าของนักศึกษาที่ยังทำไม่เสร็จได้ แม้ว่านักศึกษาจะยังไม่ได้กดเผยแพร่ก็ตาม</w:t>
-        <w:br/>
-        <w:t xml:space="preserve">   • ปุ่ม 'แก้ไข': ปรับปรุงข้อมูลส่วนตัว เช่น เปลี่ยนชื่อ หรือแก้ไขอีเมล</w:t>
-        <w:br/>
-        <w:t xml:space="preserve">   • ปุ่ม 'รีเซ็ต': ใช้ตั้งรหัสผ่านใหม่ให้นักศึกษาในกรณีที่นักศึกษาลืมรหัสผ่าน</w:t>
+        <w:t>สำหรับนักศึกษาที่ยังทำไม่เสร็จ (สถานะขึ้นแบบร่าง) อาจารย์สามารถคลิกปุ่ม 'ตรวจแบบร่าง 🔍' (สีส้ม) เพื่อเข้าไปดูความคืบหน้าของงานได้ แม้ว่านักศึกษาจะยังไม่ได้กดเผยแพร่ก็ตาม ช่วยให้อาจารย์ให้คำแนะนำก่อนส่งจริงได้</w:t>
+      </w:r>
+    </w:p>
+    <w:p>
+      <w:pPr>
+        <w:pStyle w:val="ListBullet"/>
+        <w:spacing w:before="0" w:after="60" w:line="276" w:lineRule="auto"/>
+      </w:pPr>
+      <w:r>
+        <w:rPr>
+          <w:rFonts w:ascii="TH Sarabun New" w:hAnsi="TH Sarabun New"/>
+          <w:b/>
+          <w:color w:val="0F172A"/>
+          <w:sz w:val="23"/>
+        </w:rPr>
+        <w:t xml:space="preserve">• ฟังก์ชัน 3.5 — การเพิ่มบัญชีนักศึกษาใหม่ (+ Add Student): </w:t>
+      </w:r>
+      <w:r>
+        <w:rPr>
+          <w:rFonts w:ascii="TH Sarabun New" w:hAnsi="TH Sarabun New"/>
+          <w:color w:val="334155"/>
+          <w:sz w:val="23"/>
+        </w:rPr>
+        <w:t>คลิกปุ่มสีม่วง '+ Add Student' แล้วกรอกรหัสนักศึกษา, ชื่อ-นามสกุล, อีเมล, รหัสผ่านเริ่มต้น, และชั้นปี ระบบจะเปิดบัญชีให้ทันที</w:t>
+      </w:r>
+    </w:p>
+    <w:p>
+      <w:pPr>
+        <w:pStyle w:val="ListBullet"/>
+        <w:spacing w:before="0" w:after="60" w:line="276" w:lineRule="auto"/>
+      </w:pPr>
+      <w:r>
+        <w:rPr>
+          <w:rFonts w:ascii="TH Sarabun New" w:hAnsi="TH Sarabun New"/>
+          <w:b/>
+          <w:color w:val="0F172A"/>
+          <w:sz w:val="23"/>
+        </w:rPr>
+        <w:t xml:space="preserve">• ฟังก์ชัน 3.6 — การรีเซ็ตรหัสผ่านให้นักศึกษา (Reset Password): </w:t>
+      </w:r>
+      <w:r>
+        <w:rPr>
+          <w:rFonts w:ascii="TH Sarabun New" w:hAnsi="TH Sarabun New"/>
+          <w:color w:val="334155"/>
+          <w:sz w:val="23"/>
+        </w:rPr>
+        <w:t>กรณีนักศึกษาลืมรหัสผ่าน เพียงค้นหาชื่อนักศึกษาแล้วคลิกปุ่ม 'รีเซ็ต' (ไอคอนรูปกุญแจ 🔑) ระบบจะตั้งรหัสผ่านใหม่ให้นักศึกษาได้ทันทีในเวลาไม่เกิน 5 วินาที</w:t>
+      </w:r>
+    </w:p>
+    <w:p>
+      <w:pPr>
+        <w:pStyle w:val="ListBullet"/>
+        <w:spacing w:before="0" w:after="60" w:line="276" w:lineRule="auto"/>
+      </w:pPr>
+      <w:r>
+        <w:rPr>
+          <w:rFonts w:ascii="TH Sarabun New" w:hAnsi="TH Sarabun New"/>
+          <w:b/>
+          <w:color w:val="0F172A"/>
+          <w:sz w:val="23"/>
+        </w:rPr>
+        <w:t xml:space="preserve">• ฟังก์ชัน 3.7 — การแก้ไขข้อมูลและจัดการสถานะบัญชี (Edit &amp; Status Toggle): </w:t>
+      </w:r>
+      <w:r>
+        <w:rPr>
+          <w:rFonts w:ascii="TH Sarabun New" w:hAnsi="TH Sarabun New"/>
+          <w:color w:val="334155"/>
+          <w:sz w:val="23"/>
+        </w:rPr>
+        <w:t>คลิกปุ่ม 'แก้ไข' เพื่อปรับปรุงข้อมูลส่วนตัว หรือคลิกปุ่ม 'เปิด/ปิดบัญชี' (ไอคอน Power) เพื่อเปลี่ยนสถานะเป็น Inactive (ระงับชั่วคราว) หรือ Active (เปิดใช้งาน)</w:t>
       </w:r>
     </w:p>
     <w:p>
@@ -2133,7 +2246,7 @@
           <w:rFonts w:ascii="TH Sarabun New" w:hAnsi="TH Sarabun New"/>
           <w:b/>
           <w:color w:val="1E3A8A"/>
-          <w:sz w:val="36"/>
+          <w:sz w:val="34"/>
         </w:rPr>
         <w:t>🌐 บทที่ 4: สำหรับ "ผู้เข้าชมภายนอกและนายจ้าง" (Visitor &amp; Employer)</w:t>
       </w:r>
@@ -2146,9 +2259,9 @@
         <w:rPr>
           <w:rFonts w:ascii="TH Sarabun New" w:hAnsi="TH Sarabun New"/>
           <w:color w:val="334155"/>
-          <w:sz w:val="24"/>
+          <w:sz w:val="23"/>
         </w:rPr>
-        <w:t>บุคคลภายนอก เช่น กรรมการประเมินหลักสูตร, ฝ่ายบุคคล (HR), หรือผู้บริหารบริษัทไอที สามารถเปิดรับชมผลงานของนักศึกษาได้ 2 รูปแบบ:</w:t>
+        <w:t>บุคคลภายนอก เช่น กรรมการประเมินหลักสูตร, ฝ่ายบุคคล (HR), หรือผู้บริหารบริษัทไอที สามารถเปิดรับชมผลงานของนักศึกษาได้ง่ายๆ ดังนี้:</w:t>
       </w:r>
     </w:p>
     <w:p>
@@ -2203,7 +2316,7 @@
           <w:color w:val="64748B"/>
           <w:sz w:val="20"/>
         </w:rPr>
-        <w:t>📷 ภาพที่ 5: หน้าทำเนียบผลงานนักศึกษาสาธารณะ (Public Portfolio Showcase) (ภาพถ่ายหน้าจอระบบจริง)</w:t>
+        <w:t>📷 ภาพที่ 5: หน้าแสดงเรซูเม่และแฟ้มผลงานสาธารณะจริง (Public Portfolio Showcase) (ภาพถ่ายหน้าจอระบบจริง)</w:t>
       </w:r>
     </w:p>
     <w:p>
@@ -2216,17 +2329,17 @@
           <w:rFonts w:ascii="TH Sarabun New" w:hAnsi="TH Sarabun New"/>
           <w:b/>
           <w:color w:val="0F172A"/>
-          <w:sz w:val="24"/>
+          <w:sz w:val="23"/>
         </w:rPr>
-        <w:t xml:space="preserve">รูปแบบที่ 1: เข้าชมผ่านลิงก์ตรง (Direct Portfolio Link) — </w:t>
+        <w:t xml:space="preserve">• ฟังก์ชัน 4.1 — เปิดชมผ่านลิงก์โดยตรง (Direct URL): </w:t>
       </w:r>
       <w:r>
         <w:rPr>
           <w:rFonts w:ascii="TH Sarabun New" w:hAnsi="TH Sarabun New"/>
           <w:color w:val="334155"/>
-          <w:sz w:val="24"/>
+          <w:sz w:val="23"/>
         </w:rPr>
-        <w:t>เปิดชมจากลิงก์เฉพาะของนักศึกษาที่แนบมาในใบสมัครงาน (เช่น /r/somchai-portfolio) ซึ่งจะเปิดตรงเข้าสู่หน้าเรซูเม่ของนักศึกษาคนนั้นทันที</w:t>
+        <w:t>คลิกเปิดจากลิงก์เฉพาะของนักศึกษาที่แนบมา (เช่น /r/65010001) ซึ่งจะเปิดตรงเข้าสู่หน้าเรซูเม่ของนักศึกษาคนนั้นทันทีโดยไม่ต้องเข้าสู่ระบบ</w:t>
       </w:r>
     </w:p>
     <w:p>
@@ -2239,17 +2352,17 @@
           <w:rFonts w:ascii="TH Sarabun New" w:hAnsi="TH Sarabun New"/>
           <w:b/>
           <w:color w:val="0F172A"/>
-          <w:sz w:val="24"/>
+          <w:sz w:val="23"/>
         </w:rPr>
-        <w:t xml:space="preserve">รูปแบบที่ 2: เข้าชมผ่านทำเนียบผลงานรวม (Public Showcase) — </w:t>
+        <w:t xml:space="preserve">• ฟังก์ชัน 4.2 — เปิดชมทำเนียบผลงานรวม (Public Showcase): </w:t>
       </w:r>
       <w:r>
         <w:rPr>
           <w:rFonts w:ascii="TH Sarabun New" w:hAnsi="TH Sarabun New"/>
           <w:color w:val="334155"/>
-          <w:sz w:val="24"/>
+          <w:sz w:val="23"/>
         </w:rPr>
-        <w:t>เข้าชมที่หน้าทำเนียบรวม (/dashboard) เพื่อค้นหาและเลือกชมผลงานของนักศึกษาทุกคนในสาขาที่เปิดเผยแพร่สาธารณะ สามารถค้นหาตามชื่อ หรือทักษะที่สนใจได้</w:t>
+        <w:t>เข้าหน้าเว็บ /dashboard เพื่อเลือกชมทำเนียบ Portfolio ของนักศึกษาทั้งหมดที่เปิดเผยแพร่สาธารณะ สามารถค้นหาตามชื่อ หรือทักษะที่สนใจได้</w:t>
       </w:r>
     </w:p>
     <w:p>
@@ -2262,17 +2375,17 @@
           <w:rFonts w:ascii="TH Sarabun New" w:hAnsi="TH Sarabun New"/>
           <w:b/>
           <w:color w:val="0F172A"/>
-          <w:sz w:val="24"/>
+          <w:sz w:val="23"/>
         </w:rPr>
-        <w:t xml:space="preserve">รูปแบบที่ 3: ความพร้อมในการเปิดบนทุกอุปกรณ์ — </w:t>
+        <w:t xml:space="preserve">• ฟังก์ชัน 4.3 — การพิมพ์หรือบันทึกเป็น PDF (Print to PDF): </w:t>
       </w:r>
       <w:r>
         <w:rPr>
           <w:rFonts w:ascii="TH Sarabun New" w:hAnsi="TH Sarabun New"/>
           <w:color w:val="334155"/>
-          <w:sz w:val="24"/>
+          <w:sz w:val="23"/>
         </w:rPr>
-        <w:t>ระบบจัดหน้าตาแบบ Responsive Layout ทำให้อ่านง่าย ชัดเจน ทั้งบนคอมพิวเตอร์ แท็บเล็ต และสมาร์ตโฟน โดยไม่ต้องลงแอปพลิเคชันเพิ่มเติม</w:t>
+        <w:t>เมื่อเปิดหน้าเรซูเม่ ให้กดปุ่ม Ctrl + P (Windows) หรือ Cmd + P (Mac) แล้วเลือกปลายทางเป็น 'Save as PDF' ระบบมี CSS Print Stylesheet ช่วยจัดขอบกระดาษ A4 ให้อัตโนมัติ สามารถเซฟเป็นไฟล์ PDF เก็บไว้นำเสนอกรรมการได้ทันที</w:t>
       </w:r>
     </w:p>
     <w:p>
@@ -2291,7 +2404,7 @@
           <w:rFonts w:ascii="TH Sarabun New" w:hAnsi="TH Sarabun New"/>
           <w:b/>
           <w:color w:val="1E3A8A"/>
-          <w:sz w:val="36"/>
+          <w:sz w:val="34"/>
         </w:rPr>
         <w:t>❓ บทที่ 5: คำถามที่พบบ่อยและการแก้ปัญหา (FAQ)</w:t>
       </w:r>
@@ -2300,14 +2413,14 @@
       <w:pPr>
         <w:pStyle w:val="Heading2"/>
         <w:keepNext/>
-        <w:spacing w:before="280" w:after="80"/>
+        <w:spacing w:before="260" w:after="80"/>
       </w:pPr>
       <w:r>
         <w:rPr>
           <w:rFonts w:ascii="TH Sarabun New" w:hAnsi="TH Sarabun New"/>
           <w:b/>
           <w:color w:val="0369A1"/>
-          <w:sz w:val="30"/>
+          <w:sz w:val="28"/>
         </w:rPr>
         <w:t>Q1: นักศึกษาส่งลิงก์ให้อาจารย์แล้ว แต่อาจารย์เปิดแล้วพบว่าไม่มีข้อมูล หรือขึ้นว่าไม่พบหน้าเว็บ?</w:t>
       </w:r>
@@ -2320,7 +2433,7 @@
         <w:rPr>
           <w:rFonts w:ascii="TH Sarabun New" w:hAnsi="TH Sarabun New"/>
           <w:color w:val="334155"/>
-          <w:sz w:val="24"/>
+          <w:sz w:val="23"/>
         </w:rPr>
         <w:t>สาเหตุ: นักศึกษาอาจจะกดเพียงแค่ปุ่ม 'บันทึกฉบับร่าง (Save Draft)' แต่ยังไม่ได้คลิกปุ่ม 'เผยแพร่ (Publish)'</w:t>
         <w:br/>
@@ -2336,14 +2449,14 @@
       <w:pPr>
         <w:pStyle w:val="Heading2"/>
         <w:keepNext/>
-        <w:spacing w:before="280" w:after="80"/>
+        <w:spacing w:before="260" w:after="80"/>
       </w:pPr>
       <w:r>
         <w:rPr>
           <w:rFonts w:ascii="TH Sarabun New" w:hAnsi="TH Sarabun New"/>
           <w:b/>
           <w:color w:val="0369A1"/>
-          <w:sz w:val="30"/>
+          <w:sz w:val="28"/>
         </w:rPr>
         <w:t>Q2: นักศึกษาลืมรหัสผ่านเข้าสู่ระบบ ต้องทำอย่างไร?</w:t>
       </w:r>
@@ -2356,7 +2469,7 @@
         <w:rPr>
           <w:rFonts w:ascii="TH Sarabun New" w:hAnsi="TH Sarabun New"/>
           <w:color w:val="334155"/>
-          <w:sz w:val="24"/>
+          <w:sz w:val="23"/>
         </w:rPr>
         <w:t>วิธีแก้: ให้นักศึกษาแจ้งรหัสนักศึกษาแก่อาจารย์ที่ปรึกษาหรือผู้ดูแลระบบ อาจารย์สามารถเข้าไปที่หน้า /admin ค้นหารหัสนักศึกษา แล้วคลิกปุ่ม 'รีเซ็ต' ระบบจะตั้งรหัสผ่านใหม่ให้นักศึกษาได้ทันทีในเวลาไม่เกิน 5 วินาที</w:t>
       </w:r>
@@ -2370,14 +2483,14 @@
       <w:pPr>
         <w:pStyle w:val="Heading2"/>
         <w:keepNext/>
-        <w:spacing w:before="280" w:after="80"/>
+        <w:spacing w:before="260" w:after="80"/>
       </w:pPr>
       <w:r>
         <w:rPr>
           <w:rFonts w:ascii="TH Sarabun New" w:hAnsi="TH Sarabun New"/>
           <w:b/>
           <w:color w:val="0369A1"/>
-          <w:sz w:val="30"/>
+          <w:sz w:val="28"/>
         </w:rPr>
         <w:t>Q3: แก้ไขข้อมูลหรือเพิ่มผลงานใหม่แล้ว ผู้ที่เปิดลิงก์อยู่จะเห็นข้อมูลอัปเดตทันทีเลยหรือไม่?</w:t>
       </w:r>
@@ -2390,7 +2503,7 @@
         <w:rPr>
           <w:rFonts w:ascii="TH Sarabun New" w:hAnsi="TH Sarabun New"/>
           <w:color w:val="334155"/>
-          <w:sz w:val="24"/>
+          <w:sz w:val="23"/>
         </w:rPr>
         <w:t>คำตอบ: ทันทีที่นักศึกษาคลิกปุ่ม 'เผยแพร่ (Publish)' ข้อมูลจะถูกอัปเดตขึ้นเซิร์ฟเวอร์ทันที ผู้ที่เปิดหน้าเว็บผลงานอยู่เพียงแค่กดปุ่ม Refresh (F5) บนเบราว์เซอร์ ก็จะเห็นข้อมูลเวอร์ชันใหม่ทันที</w:t>
       </w:r>
@@ -2404,14 +2517,14 @@
       <w:pPr>
         <w:pStyle w:val="Heading2"/>
         <w:keepNext/>
-        <w:spacing w:before="280" w:after="80"/>
+        <w:spacing w:before="260" w:after="80"/>
       </w:pPr>
       <w:r>
         <w:rPr>
           <w:rFonts w:ascii="TH Sarabun New" w:hAnsi="TH Sarabun New"/>
           <w:b/>
           <w:color w:val="0369A1"/>
-          <w:sz w:val="30"/>
+          <w:sz w:val="28"/>
         </w:rPr>
         <w:t>Q4: หากกำลังตกแต่งเรซูแม่อยู่แล้วเผลอปิดหน้าต่างเบราว์เซอร์ หรือไฟดับ ข้อมูลที่ทำไว้จะสูญหายหรือไม่?</w:t>
       </w:r>
@@ -2424,7 +2537,7 @@
         <w:rPr>
           <w:rFonts w:ascii="TH Sarabun New" w:hAnsi="TH Sarabun New"/>
           <w:color w:val="334155"/>
-          <w:sz w:val="24"/>
+          <w:sz w:val="23"/>
         </w:rPr>
         <w:t>คำตอบ: ตราบใดที่ท่านได้เคยกดปุ่ม 'บันทึกฉบับร่าง (Save Draft)' ข้อมูลทั้งหมดจะถูกจัดเก็บไว้อย่างปลอดภัยบนฐานข้อมูลของระบบ เมื่อท่านเปิดระบบเข้ามาใหม่ ข้อมูลและรูปแบบที่จัดไว้จะกลับมาครบถ้วนอย่างแน่นอน</w:t>
       </w:r>
@@ -2438,14 +2551,14 @@
       <w:pPr>
         <w:pStyle w:val="Heading2"/>
         <w:keepNext/>
-        <w:spacing w:before="280" w:after="80"/>
+        <w:spacing w:before="260" w:after="80"/>
       </w:pPr>
       <w:r>
         <w:rPr>
           <w:rFonts w:ascii="TH Sarabun New" w:hAnsi="TH Sarabun New"/>
           <w:b/>
           <w:color w:val="0369A1"/>
-          <w:sz w:val="30"/>
+          <w:sz w:val="28"/>
         </w:rPr>
         <w:t>Q5: หน้าจอแจ้งเตือนว่า 'บัญชีของท่านถูกระงับการใช้งาน (Inactive)' เกิดจากอะไร?</w:t>
       </w:r>
@@ -2458,7 +2571,7 @@
         <w:rPr>
           <w:rFonts w:ascii="TH Sarabun New" w:hAnsi="TH Sarabun New"/>
           <w:color w:val="334155"/>
-          <w:sz w:val="24"/>
+          <w:sz w:val="23"/>
         </w:rPr>
         <w:t>คำตอบ: บัญชีของท่านอาจถูกตั้งสถานะพักการใช้งานจากผู้ดูแลระบบ ให้ติดต่ออาจารย์ผู้ดูแลระบบเพื่อเปิดสถานะบัญชีกลับมาเป็น 'Active' อีกครั้ง</w:t>
       </w:r>
@@ -2479,7 +2592,7 @@
           <w:rFonts w:ascii="TH Sarabun New" w:hAnsi="TH Sarabun New"/>
           <w:b/>
           <w:color w:val="1E3A8A"/>
-          <w:sz w:val="36"/>
+          <w:sz w:val="34"/>
         </w:rPr>
         <w:t>📞 บทที่ 6: ช่องทางการติดต่อและสนับสนุนระบบ</w:t>
       </w:r>
@@ -2678,7 +2791,7 @@
         <w:color w:val="94A3B8"/>
         <w:sz w:val="18"/>
       </w:rPr>
-      <w:t>ภาควิชาวิศวกรรมคอมพิวเตอร์ — ระบบแฟ้มสะสมผลงานดิจิทัล (หน้าแสดงเอกสาร)</w:t>
+      <w:t>ภาควิชาวิศวกรรมคอมพิวเตอร์ — ระบบแฟ้มสะสมผลงานดิจิทัล (เอกสารคู่มือการใช้งาน)</w:t>
     </w:r>
   </w:p>
 </w:ftr>
@@ -2697,7 +2810,7 @@
         <w:color w:val="94A3B8"/>
         <w:sz w:val="18"/>
       </w:rPr>
-      <w:t>PFS - Portfolio &amp; Resume System | คู่มือการใช้งานสำหรับผู้ใช้ทั่วไป</w:t>
+      <w:t>PFS - Portfolio &amp; Resume System | คู่มือการใช้งานฟังก์ชันระบบอย่างละเอียด</w:t>
     </w:r>
   </w:p>
 </w:hdr>

</xml_diff>